<commit_message>
Add usage analytics and an Analytics page to the content portal
Admins and analysts see learners, who is active today, this week and
this month, a daily series, 1-, 7- and 30-day retention, quizzes by
mode, and the most-missed questions with open reports. The numbers are
calculated from what the app already records, so nothing extra is
tracked, except one small marker: the app now tells the server once a
day that it was opened, which retention needs. The marker goes when a
learner deletes their account.

The Privacy text mentions it, in all six languages. No names or emails
appear on the page.

Co-Authored-By: Claude Sonnet 5.5 <noreply@anthropic.com>
</commit_message>
<xml_diff>
--- a/docs/planning/02_Module_Plans.docx
+++ b/docs/planning/02_Module_Plans.docx
@@ -3422,7 +3422,7 @@
         <w:tc>
           <w:tcPr>
             <w:tcW w:type="dxa" w:w="8352"/>
-            <w:shd w:val="clear" w:color="auto" w:fill="EDEDED"/>
+            <w:shd w:val="clear" w:color="auto" w:fill="FFF2CC"/>
             <w:vAlign w:val="top"/>
           </w:tcPr>
           <w:p>
@@ -3431,14 +3431,14 @@
                 <w:b/>
                 <w:sz w:val="16"/>
               </w:rPr>
-              <w:t xml:space="preserve">Not started — </w:t>
+              <w:t xml:space="preserve">Partly done — </w:t>
             </w:r>
             <w:r>
               <w:rPr>
                 <w:b w:val="0"/>
                 <w:sz w:val="16"/>
               </w:rPr>
-              <w:t>No analytics events or crash reporting yet.</w:t>
+              <w:t>Usage analytics are done without a separate event stream: the Content Management Portal's Analytics page (admins and analysts) is calculated from what the app already records, plus a once-a-day note that a learner opened the app. It shows learners, activity today / 7 / 30 days, a daily series, 1-, 7- and 30-day retention, quizzes by mode, the most-missed questions and open reports. No names or emails; a learner's data goes when they delete their account. Crash reporting with Sentry is in the app. Still missing: Sentry for the API and the portal, error alerts, and the screen-level events the sheet lists (result viewed).</w:t>
             </w:r>
           </w:p>
         </w:tc>

</xml_diff>